<commit_message>
Polish mini2 validation docs and python node
</commit_message>
<xml_diff>
--- a/mini2-report.docx
+++ b/mini2-report.docx
@@ -487,6 +487,14 @@
     </w:p>
     <w:p>
       <w:pPr>
+        <w:pStyle w:val="ListBullet"/>
+      </w:pPr>
+      <w:r>
+        <w:t>With H down before a new request, the client fails clearly. If H dies after A has cached the gathered result, that same request can still finish from cache.</w:t>
+      </w:r>
+    </w:p>
+    <w:p>
+      <w:pPr>
         <w:pStyle w:val="Heading1"/>
       </w:pPr>
       <w:r>
@@ -498,7 +506,7 @@
     </w:p>
     <w:p>
       <w:r>
-        <w:t>Run the final chunk sweep on two physical computers with at least 15 runs per chunk size. Add one failure test by killing H during a long request and recording the client error.</w:t>
+        <w:t>Run the final chunk sweep on two physical computers with at least 15 runs per chunk size. Run both H-down failure cases: before a new request and after the first page is cached.</w:t>
       </w:r>
     </w:p>
     <w:sectPr>

</xml_diff>

<commit_message>
Add final two-host benchmark results
</commit_message>
<xml_diff>
--- a/mini2-report.docx
+++ b/mini2-report.docx
@@ -118,7 +118,7 @@
     </w:p>
     <w:p>
       <w:r>
-        <w:t>The course notes recommend 15-30 runs to form an average and discard clear outliers. The local table below is a three-run debug pass; the final two-computer run should use at least 15 runs per chunk size.</w:t>
+        <w:t>The course notes recommend 15-30 runs to form an average and discard clear outliers. The final table below uses 30 runs per chunk size on two laptops.</w:t>
       </w:r>
     </w:p>
     <w:p>
@@ -129,7 +129,7 @@
         <w:rPr>
           <w:rFonts w:ascii="Aptos Display" w:hAnsi="Aptos Display"/>
         </w:rPr>
-        <w:t>Local Debug Results</w:t>
+        <w:t>Two-Host Results</w:t>
       </w:r>
     </w:p>
     <w:tbl>
@@ -203,7 +203,7 @@
           </w:tcPr>
           <w:p>
             <w:r>
-              <w:t>423093</w:t>
+              <w:t>337844</w:t>
             </w:r>
           </w:p>
         </w:tc>
@@ -223,7 +223,7 @@
           </w:tcPr>
           <w:p>
             <w:r>
-              <w:t>528</w:t>
+              <w:t>422</w:t>
             </w:r>
           </w:p>
         </w:tc>
@@ -245,7 +245,7 @@
           </w:tcPr>
           <w:p>
             <w:r>
-              <w:t>100274</w:t>
+              <w:t>91303</w:t>
             </w:r>
           </w:p>
         </w:tc>
@@ -265,7 +265,7 @@
           </w:tcPr>
           <w:p>
             <w:r>
-              <w:t>501</w:t>
+              <w:t>456</w:t>
             </w:r>
           </w:p>
         </w:tc>
@@ -287,7 +287,7 @@
           </w:tcPr>
           <w:p>
             <w:r>
-              <w:t>31579</w:t>
+              <w:t>45748</w:t>
             </w:r>
           </w:p>
         </w:tc>
@@ -307,7 +307,7 @@
           </w:tcPr>
           <w:p>
             <w:r>
-              <w:t>631</w:t>
+              <w:t>914</w:t>
             </w:r>
           </w:p>
         </w:tc>
@@ -329,7 +329,7 @@
           </w:tcPr>
           <w:p>
             <w:r>
-              <w:t>19446</w:t>
+              <w:t>47482</w:t>
             </w:r>
           </w:p>
         </w:tc>
@@ -349,7 +349,7 @@
           </w:tcPr>
           <w:p>
             <w:r>
-              <w:t>1496</w:t>
+              <w:t>3652</w:t>
             </w:r>
           </w:p>
         </w:tc>
@@ -371,7 +371,7 @@
           </w:tcPr>
           <w:p>
             <w:r>
-              <w:t>9073</w:t>
+              <w:t>44046</w:t>
             </w:r>
           </w:p>
         </w:tc>
@@ -391,7 +391,7 @@
           </w:tcPr>
           <w:p>
             <w:r>
-              <w:t>2268</w:t>
+              <w:t>11011</w:t>
             </w:r>
           </w:p>
         </w:tc>
@@ -399,7 +399,7 @@
     </w:tbl>
     <w:p>
       <w:r>
-        <w:t>Result: 512 KB chunks completed the same 80,000-record response about 46.6x faster than 2 KB chunks on loopback because the client needed 4 chunks instead of 800.</w:t>
+        <w:t>Result: 512 KB chunks completed the same 80,000-record response about 7.7x faster than 2 KB chunks across two laptops because the client needed 4 chunks instead of 800. The 32 KB, 128 KB, and 512 KB results were close because Wi-Fi introduced large outliers.</w:t>
       </w:r>
     </w:p>
     <w:p>
@@ -415,7 +415,7 @@
     </w:p>
     <w:p>
       <w:r>
-        <w:t>Four clients at 32 KB chunks each completed 50 chunks. The slowest client was about 41% slower than the fastest, so the queue balances chunk turns but does not guarantee identical wall-clock finish times.</w:t>
+        <w:t>Four clients at 32 KB chunks each completed 50 chunks. The slowest client was about 4.3% slower than the fastest, so the queue balances chunk turns but does not guarantee identical wall-clock finish times.</w:t>
       </w:r>
     </w:p>
     <w:p>
@@ -474,6 +474,22 @@
         <w:pStyle w:val="ListBullet"/>
       </w:pPr>
       <w:r>
+        <w:t>Host2 Homebrew Python loaded macOS's older libexpat, which broke ensurepip. We used Python 3.12 with Homebrew's expat path.</w:t>
+      </w:r>
+    </w:p>
+    <w:p>
+      <w:pPr>
+        <w:pStyle w:val="ListBullet"/>
+      </w:pPr>
+      <w:r>
+        <w:t>Node I initially used fallback sample data until we copied the real shards to host2 and restarted the node.</w:t>
+      </w:r>
+    </w:p>
+    <w:p>
+      <w:pPr>
+        <w:pStyle w:val="ListBullet"/>
+      </w:pPr>
+      <w:r>
         <w:t>The first benchmark included one-record chunks, which was too slow for normal iteration. Tiny chunks are now opt-in.</w:t>
       </w:r>
     </w:p>
@@ -506,7 +522,7 @@
     </w:p>
     <w:p>
       <w:r>
-        <w:t>Run the final chunk sweep on two physical computers with at least 15 runs per chunk size. Run both H-down failure cases: before a new request and after the first page is cached.</w:t>
+        <w:t>The two-computer chunk sweep, fairness run, and H-down failure test are complete. If time allows, repeat with a larger shard set and add the mid-request H failure case after the first page is cached.</w:t>
       </w:r>
     </w:p>
     <w:sectPr>

</xml_diff>

<commit_message>
Update mini2 report and submission docs
</commit_message>
<xml_diff>
--- a/mini2-report.docx
+++ b/mini2-report.docx
@@ -103,6 +103,62 @@
     <w:p>
       <w:r>
         <w:t>Each 311 row is stored as a compact 20-byte record: unique key, latitude, longitude, incident zip, created year, status code, and borough code.</w:t>
+      </w:r>
+    </w:p>
+    <w:p>
+      <w:r>
+        <w:t>The design uses unary gRPC calls with explicit offsets. A streaming prototype was dropped because the assignment required non-streaming gRPC and the explicit offsets made failure behavior easier to test.</w:t>
+      </w:r>
+    </w:p>
+    <w:p>
+      <w:pPr>
+        <w:pStyle w:val="Heading1"/>
+      </w:pPr>
+      <w:r>
+        <w:rPr>
+          <w:rFonts w:ascii="Aptos Display" w:hAnsi="Aptos Display"/>
+        </w:rPr>
+        <w:t>Course and Lab Ideas Used</w:t>
+      </w:r>
+    </w:p>
+    <w:p>
+      <w:pPr>
+        <w:pStyle w:val="ListBullet"/>
+      </w:pPr>
+      <w:r>
+        <w:t>The basic gRPC lab shaped the protobuf/service structure.</w:t>
+      </w:r>
+    </w:p>
+    <w:p>
+      <w:pPr>
+        <w:pStyle w:val="ListBullet"/>
+      </w:pPr>
+      <w:r>
+        <w:t>The leader labs shaped A as the only public coordinator.</w:t>
+      </w:r>
+    </w:p>
+    <w:p>
+      <w:pPr>
+        <w:pStyle w:val="ListBullet"/>
+      </w:pPr>
+      <w:r>
+        <w:t>Socket and messaging lectures motivated the chunk-size experiment.</w:t>
+      </w:r>
+    </w:p>
+    <w:p>
+      <w:pPr>
+        <w:pStyle w:val="ListBullet"/>
+      </w:pPr>
+      <w:r>
+        <w:t>The sharding lecture motivated splitting the binary data across B-I.</w:t>
+      </w:r>
+    </w:p>
+    <w:p>
+      <w:pPr>
+        <w:pStyle w:val="ListBullet"/>
+      </w:pPr>
+      <w:r>
+        <w:t>MPI round/baton-style labs influenced the fairness test.</w:t>
       </w:r>
     </w:p>
     <w:p>
@@ -434,6 +490,22 @@
         <w:pStyle w:val="ListBullet"/>
       </w:pPr>
       <w:r>
+        <w:t>Early per-RPC channel/stub setup made the prototype measure setup overhead too much. Child stubs are now created once during startup.</w:t>
+      </w:r>
+    </w:p>
+    <w:p>
+      <w:pPr>
+        <w:pStyle w:val="ListBullet"/>
+      </w:pPr>
+      <w:r>
+        <w:t>A streaming/async detour was abandoned because the final design needed unary gRPC and clearer failure behavior.</w:t>
+      </w:r>
+    </w:p>
+    <w:p>
+      <w:pPr>
+        <w:pStyle w:val="ListBullet"/>
+      </w:pPr>
+      <w:r>
         <w:t>Old processes were already bound to ports 50051, 50052, and 50058, causing the client to hit the wrong server.</w:t>
       </w:r>
     </w:p>
@@ -459,6 +531,14 @@
       </w:pPr>
       <w:r>
         <w:t>Client request ids were reused. They now include a per-run timestamp.</w:t>
+      </w:r>
+    </w:p>
+    <w:p>
+      <w:pPr>
+        <w:pStyle w:val="ListBullet"/>
+      </w:pPr>
+      <w:r>
+        <w:t>Python and C++ initially had to be checked carefully for exact binary record size and field order. The final record is a validated 20-byte layout.</w:t>
       </w:r>
     </w:p>
     <w:p>
@@ -517,12 +597,79 @@
         <w:rPr>
           <w:rFonts w:ascii="Aptos Display" w:hAnsi="Aptos Display"/>
         </w:rPr>
-        <w:t>Remaining Final Work</w:t>
+        <w:t>Conclusion</w:t>
       </w:r>
     </w:p>
     <w:p>
       <w:r>
-        <w:t>The two-computer chunk sweep, fairness run, and H-down failure test are complete. If time allows, repeat with a larger shard set and add the mid-request H failure case after the first page is cached.</w:t>
+        <w:t>The final result supports one focused conclusion: chunk size changed total request time mainly by changing the number of client-leader round trips. The fastest result was useful, but it only became trustworthy after we fixed port collisions, topology mistakes, cache behavior, Python setup problems, missing shard deployment, and benchmark defaults.</w:t>
+      </w:r>
+    </w:p>
+    <w:p>
+      <w:pPr>
+        <w:pStyle w:val="Heading1"/>
+      </w:pPr>
+      <w:r>
+        <w:rPr>
+          <w:rFonts w:ascii="Aptos Display" w:hAnsi="Aptos Display"/>
+        </w:rPr>
+        <w:t>Individual Contributions</w:t>
+      </w:r>
+    </w:p>
+    <w:p>
+      <w:r>
+        <w:t>Anukrithi Myadala focused on Mini 1 feedback analysis, runbooks, two-computer setup, result collection, report, and presentation framing. Asim Mohammed contributed to the cluster/protobuf implementation and helped with final code cleanup and validation.</w:t>
+      </w:r>
+    </w:p>
+    <w:p>
+      <w:pPr>
+        <w:pStyle w:val="Heading1"/>
+      </w:pPr>
+      <w:r>
+        <w:rPr>
+          <w:rFonts w:ascii="Aptos Display" w:hAnsi="Aptos Display"/>
+        </w:rPr>
+        <w:t>References</w:t>
+      </w:r>
+    </w:p>
+    <w:p>
+      <w:pPr>
+        <w:pStyle w:val="ListBullet"/>
+      </w:pPr>
+      <w:r>
+        <w:t>NYC Open Data 311 Service Requests dataset.</w:t>
+      </w:r>
+    </w:p>
+    <w:p>
+      <w:pPr>
+        <w:pStyle w:val="ListBullet"/>
+      </w:pPr>
+      <w:r>
+        <w:t>Course lectures on messaging/socket costs, sharding, parallelism, failure behavior, and benchmarking.</w:t>
+      </w:r>
+    </w:p>
+    <w:p>
+      <w:pPr>
+        <w:pStyle w:val="ListBullet"/>
+      </w:pPr>
+      <w:r>
+        <w:t>Course labs covering basic gRPC, leader coordination, MPI round/baton behavior, and sockets.</w:t>
+      </w:r>
+    </w:p>
+    <w:p>
+      <w:pPr>
+        <w:pStyle w:val="ListBullet"/>
+      </w:pPr>
+      <w:r>
+        <w:t>gRPC and Protocol Buffers documentation for unary service structure and typed messages.</w:t>
+      </w:r>
+    </w:p>
+    <w:p>
+      <w:pPr>
+        <w:pStyle w:val="ListBullet"/>
+      </w:pPr>
+      <w:r>
+        <w:t>Data structure alignment notes used after Mini 1 feedback.</w:t>
       </w:r>
     </w:p>
     <w:sectPr>

</xml_diff>

<commit_message>
Focus mini2 report on findings and validation
</commit_message>
<xml_diff>
--- a/mini2-report.docx
+++ b/mini2-report.docx
@@ -126,7 +126,7 @@
         <w:pStyle w:val="ListBullet"/>
       </w:pPr>
       <w:r>
-        <w:t>The basic gRPC lab shaped the protobuf/service structure.</w:t>
+        <w:t>The basic-grpc lab shaped the protobuf/service structure and unary call pattern.</w:t>
       </w:r>
     </w:p>
     <w:p>
@@ -134,7 +134,15 @@
         <w:pStyle w:val="ListBullet"/>
       </w:pPr>
       <w:r>
-        <w:t>The leader labs shaped A as the only public coordinator.</w:t>
+        <w:t>The leader-adv lab shaped A as the coordinator while B-I do shard work.</w:t>
+      </w:r>
+    </w:p>
+    <w:p>
+      <w:pPr>
+        <w:pStyle w:val="ListBullet"/>
+      </w:pPr>
+      <w:r>
+        <w:t>The socket interoperability lab made us treat the C++/Python 20-byte record layout as a contract.</w:t>
       </w:r>
     </w:p>
     <w:p>
@@ -161,6 +169,182 @@
         <w:t>MPI round/baton-style labs influenced the fairness test.</w:t>
       </w:r>
     </w:p>
+    <w:p>
+      <w:pPr>
+        <w:pStyle w:val="Heading1"/>
+      </w:pPr>
+      <w:r>
+        <w:rPr>
+          <w:rFonts w:ascii="Aptos Display" w:hAnsi="Aptos Display"/>
+        </w:rPr>
+        <w:t>Mini 2 Questions Answered</w:t>
+      </w:r>
+    </w:p>
+    <w:tbl>
+      <w:tblPr>
+        <w:tblStyle w:val="TableGrid"/>
+        <w:tblW w:type="auto" w:w="0"/>
+        <w:tblLook w:firstColumn="1" w:firstRow="1" w:lastColumn="0" w:lastRow="0" w:noHBand="0" w:noVBand="1" w:val="04A0"/>
+      </w:tblPr>
+      <w:tblGrid>
+        <w:gridCol w:w="4968"/>
+        <w:gridCol w:w="4968"/>
+      </w:tblGrid>
+      <w:tr>
+        <w:tc>
+          <w:tcPr>
+            <w:tcW w:type="dxa" w:w="4968"/>
+          </w:tcPr>
+          <w:p>
+            <w:r>
+              <w:t>Prompt challenge</w:t>
+            </w:r>
+          </w:p>
+        </w:tc>
+        <w:tc>
+          <w:tcPr>
+            <w:tcW w:type="dxa" w:w="4968"/>
+          </w:tcPr>
+          <w:p>
+            <w:r>
+              <w:t>Our answer</w:t>
+            </w:r>
+          </w:p>
+        </w:tc>
+      </w:tr>
+      <w:tr>
+        <w:tc>
+          <w:tcPr>
+            <w:tcW w:type="dxa" w:w="4968"/>
+          </w:tcPr>
+          <w:p>
+            <w:r>
+              <w:t>Performance/resources</w:t>
+            </w:r>
+          </w:p>
+        </w:tc>
+        <w:tc>
+          <w:tcPr>
+            <w:tcW w:type="dxa" w:w="4968"/>
+          </w:tcPr>
+          <w:p>
+            <w:r>
+              <w:t>30-run chunk sweep measured total time, chunk count, avg RPC time, min RPC time, and max RPC time.</w:t>
+            </w:r>
+          </w:p>
+        </w:tc>
+      </w:tr>
+      <w:tr>
+        <w:tc>
+          <w:tcPr>
+            <w:tcW w:type="dxa" w:w="4968"/>
+          </w:tcPr>
+          <w:p>
+            <w:r>
+              <w:t>Conserve memory</w:t>
+            </w:r>
+          </w:p>
+        </w:tc>
+        <w:tc>
+          <w:tcPr>
+            <w:tcW w:type="dxa" w:w="4968"/>
+          </w:tcPr>
+          <w:p>
+            <w:r>
+              <w:t>20-byte typed records, explicit chunk offsets, and a 1 MB max chunk instead of unbounded responses.</w:t>
+            </w:r>
+          </w:p>
+        </w:tc>
+      </w:tr>
+      <w:tr>
+        <w:tc>
+          <w:tcPr>
+            <w:tcW w:type="dxa" w:w="4968"/>
+          </w:tcPr>
+          <w:p>
+            <w:r>
+              <w:t>Fairness/balance</w:t>
+            </w:r>
+          </w:p>
+        </w:tc>
+        <w:tc>
+          <w:tcPr>
+            <w:tcW w:type="dxa" w:w="4968"/>
+          </w:tcPr>
+          <w:p>
+            <w:r>
+              <w:t>Four-client run showed equal chunk turns, but not identical finish times.</w:t>
+            </w:r>
+          </w:p>
+        </w:tc>
+      </w:tr>
+      <w:tr>
+        <w:tc>
+          <w:tcPr>
+            <w:tcW w:type="dxa" w:w="4968"/>
+          </w:tcPr>
+          <w:p>
+            <w:r>
+              <w:t>Flexible overlay</w:t>
+            </w:r>
+          </w:p>
+        </w:tc>
+        <w:tc>
+          <w:tcPr>
+            <w:tcW w:type="dxa" w:w="4968"/>
+          </w:tcPr>
+          <w:p>
+            <w:r>
+              <w:t>Host/process/tree settings live in YAML; identity and config path are runtime arguments.</w:t>
+            </w:r>
+          </w:p>
+        </w:tc>
+      </w:tr>
+      <w:tr>
+        <w:tc>
+          <w:tcPr>
+            <w:tcW w:type="dxa" w:w="4968"/>
+          </w:tcPr>
+          <w:p>
+            <w:r>
+              <w:t>No flat shortcut</w:t>
+            </w:r>
+          </w:p>
+        </w:tc>
+        <w:tc>
+          <w:tcPr>
+            <w:tcW w:type="dxa" w:w="4968"/>
+          </w:tcPr>
+          <w:p>
+            <w:r>
+              <w:t>Final tree uses A -&gt; B,H,G,I; B -&gt; C,D,E; E -&gt; F.</w:t>
+            </w:r>
+          </w:p>
+        </w:tc>
+      </w:tr>
+      <w:tr>
+        <w:tc>
+          <w:tcPr>
+            <w:tcW w:type="dxa" w:w="4968"/>
+          </w:tcPr>
+          <w:p>
+            <w:r>
+              <w:t>Request failure/abandonment</w:t>
+            </w:r>
+          </w:p>
+        </w:tc>
+        <w:tc>
+          <w:tcPr>
+            <w:tcW w:type="dxa" w:w="4968"/>
+          </w:tcPr>
+          <w:p>
+            <w:r>
+              <w:t>Fail-fast before gather; cache-complete behavior after gather; no speculative prefetching because it would increase A memory pressure.</w:t>
+            </w:r>
+          </w:p>
+        </w:tc>
+      </w:tr>
+    </w:tbl>
     <w:p>
       <w:pPr>
         <w:pStyle w:val="Heading1"/>

</xml_diff>

<commit_message>
Add external references to mini2 report
</commit_message>
<xml_diff>
--- a/mini2-report.docx
+++ b/mini2-report.docx
@@ -821,7 +821,47 @@
         <w:pStyle w:val="ListBullet"/>
       </w:pPr>
       <w:r>
-        <w:t>NYC Open Data 311 Service Requests dataset.</w:t>
+        <w:t>NYC Open Data / Data.gov, 311 Service Requests from 2020 to Present: https://catalog.data.gov/dataset/311-service-requests-from-2010-to-present</w:t>
+      </w:r>
+    </w:p>
+    <w:p>
+      <w:pPr>
+        <w:pStyle w:val="ListBullet"/>
+      </w:pPr>
+      <w:r>
+        <w:t>NYC Open Data, 311 Service Requests Updates: https://opendata.cityofnewyork.us/311-service-requests-from-2010-to-present-updates/</w:t>
+      </w:r>
+    </w:p>
+    <w:p>
+      <w:pPr>
+        <w:pStyle w:val="ListBullet"/>
+      </w:pPr>
+      <w:r>
+        <w:t>gRPC, Performance Best Practices: https://grpc.io/docs/guides/performance/</w:t>
+      </w:r>
+    </w:p>
+    <w:p>
+      <w:pPr>
+        <w:pStyle w:val="ListBullet"/>
+      </w:pPr>
+      <w:r>
+        <w:t>Protocol Buffers, Encoding: https://protobuf.dev/programming-guides/encoding/</w:t>
+      </w:r>
+    </w:p>
+    <w:p>
+      <w:pPr>
+        <w:pStyle w:val="ListBullet"/>
+      </w:pPr>
+      <w:r>
+        <w:t>Protocol Buffers, Language Guide (proto3): https://protobuf.dev/programming-guides/proto3/</w:t>
+      </w:r>
+    </w:p>
+    <w:p>
+      <w:pPr>
+        <w:pStyle w:val="ListBullet"/>
+      </w:pPr>
+      <w:r>
+        <w:t>AMD Vitis HLS Documentation, Data Structure Padding: https://docs.amd.com/r/2024.1-English/ug1399-vitis-hls/Data-Structure-Padding</w:t>
       </w:r>
     </w:p>
     <w:p>
@@ -838,22 +878,6 @@
       </w:pPr>
       <w:r>
         <w:t>Course labs covering basic gRPC, leader coordination, MPI round/baton behavior, and sockets.</w:t>
-      </w:r>
-    </w:p>
-    <w:p>
-      <w:pPr>
-        <w:pStyle w:val="ListBullet"/>
-      </w:pPr>
-      <w:r>
-        <w:t>gRPC and Protocol Buffers documentation for unary service structure and typed messages.</w:t>
-      </w:r>
-    </w:p>
-    <w:p>
-      <w:pPr>
-        <w:pStyle w:val="ListBullet"/>
-      </w:pPr>
-      <w:r>
-        <w:t>Data structure alignment notes used after Mini 1 feedback.</w:t>
       </w:r>
     </w:p>
     <w:sectPr>

</xml_diff>

<commit_message>
Correct mini2 poster finding around chunk-size knee
</commit_message>
<xml_diff>
--- a/mini2-report.docx
+++ b/mini2-report.docx
@@ -639,7 +639,354 @@
     </w:tbl>
     <w:p>
       <w:r>
-        <w:t>Result: 512 KB chunks completed the same 80,000-record response about 7.7x faster than 2 KB chunks across two laptops because the client needed 4 chunks instead of 800. The 32 KB, 128 KB, and 512 KB results were close because Wi-Fi introduced large outliers.</w:t>
+        <w:t>Result: 512 KB chunks completed the same 80,000-record response about 7.7x faster than 2 KB chunks across two laptops because the client needed 4 chunks instead of 800. The more interesting result is the knee in the curve: 32 KB used 50 chunks and averaged 45.7 ms, while 512 KB used only 4 chunks and averaged 44.0 ms. That 1.7 ms difference means page count stopped being the only important cost after about 32 KB.</w:t>
+      </w:r>
+    </w:p>
+    <w:p>
+      <w:r>
+        <w:t>The accurate interpretation is that chunk size shifts cost between repeated paging overhead and a fixed gather/transfer floor. The first page triggers A to gather and cache the full 1.6 MB response from B-I. Later pages come from A's cache, so small chunks pay many local unary RPC/cache-copy steps. Once chunks are large enough, the remaining time is dominated by the one-time gather, payload movement, serialization/copying, and Wi-Fi tail spikes.</w:t>
+      </w:r>
+    </w:p>
+    <w:p>
+      <w:pPr>
+        <w:pStyle w:val="Heading1"/>
+      </w:pPr>
+      <w:r>
+        <w:rPr>
+          <w:rFonts w:ascii="Aptos Display" w:hAnsi="Aptos Display"/>
+        </w:rPr>
+        <w:t>Mean, Median, and Tail Behavior</w:t>
+      </w:r>
+    </w:p>
+    <w:tbl>
+      <w:tblPr>
+        <w:tblStyle w:val="TableGrid"/>
+        <w:tblW w:type="auto" w:w="0"/>
+        <w:tblLook w:firstColumn="1" w:firstRow="1" w:lastColumn="0" w:lastRow="0" w:noHBand="0" w:noVBand="1" w:val="04A0"/>
+      </w:tblPr>
+      <w:tblGrid>
+        <w:gridCol w:w="1987"/>
+        <w:gridCol w:w="1987"/>
+        <w:gridCol w:w="1987"/>
+        <w:gridCol w:w="1987"/>
+        <w:gridCol w:w="1987"/>
+      </w:tblGrid>
+      <w:tr>
+        <w:tc>
+          <w:tcPr>
+            <w:tcW w:type="dxa" w:w="1987"/>
+          </w:tcPr>
+          <w:p>
+            <w:r>
+              <w:t>Chunk bytes</w:t>
+            </w:r>
+          </w:p>
+        </w:tc>
+        <w:tc>
+          <w:tcPr>
+            <w:tcW w:type="dxa" w:w="1987"/>
+          </w:tcPr>
+          <w:p>
+            <w:r>
+              <w:t>Mean ms</w:t>
+            </w:r>
+          </w:p>
+        </w:tc>
+        <w:tc>
+          <w:tcPr>
+            <w:tcW w:type="dxa" w:w="1987"/>
+          </w:tcPr>
+          <w:p>
+            <w:r>
+              <w:t>Median ms</w:t>
+            </w:r>
+          </w:p>
+        </w:tc>
+        <w:tc>
+          <w:tcPr>
+            <w:tcW w:type="dxa" w:w="1987"/>
+          </w:tcPr>
+          <w:p>
+            <w:r>
+              <w:t>P90 ms</w:t>
+            </w:r>
+          </w:p>
+        </w:tc>
+        <w:tc>
+          <w:tcPr>
+            <w:tcW w:type="dxa" w:w="1987"/>
+          </w:tcPr>
+          <w:p>
+            <w:r>
+              <w:t>CV</w:t>
+            </w:r>
+          </w:p>
+        </w:tc>
+      </w:tr>
+      <w:tr>
+        <w:tc>
+          <w:tcPr>
+            <w:tcW w:type="dxa" w:w="1987"/>
+          </w:tcPr>
+          <w:p>
+            <w:r>
+              <w:t>2000</w:t>
+            </w:r>
+          </w:p>
+        </w:tc>
+        <w:tc>
+          <w:tcPr>
+            <w:tcW w:type="dxa" w:w="1987"/>
+          </w:tcPr>
+          <w:p>
+            <w:r>
+              <w:t>337.8</w:t>
+            </w:r>
+          </w:p>
+        </w:tc>
+        <w:tc>
+          <w:tcPr>
+            <w:tcW w:type="dxa" w:w="1987"/>
+          </w:tcPr>
+          <w:p>
+            <w:r>
+              <w:t>345.6</w:t>
+            </w:r>
+          </w:p>
+        </w:tc>
+        <w:tc>
+          <w:tcPr>
+            <w:tcW w:type="dxa" w:w="1987"/>
+          </w:tcPr>
+          <w:p>
+            <w:r>
+              <w:t>391.7</w:t>
+            </w:r>
+          </w:p>
+        </w:tc>
+        <w:tc>
+          <w:tcPr>
+            <w:tcW w:type="dxa" w:w="1987"/>
+          </w:tcPr>
+          <w:p>
+            <w:r>
+              <w:t>0.14</w:t>
+            </w:r>
+          </w:p>
+        </w:tc>
+      </w:tr>
+      <w:tr>
+        <w:tc>
+          <w:tcPr>
+            <w:tcW w:type="dxa" w:w="1987"/>
+          </w:tcPr>
+          <w:p>
+            <w:r>
+              <w:t>8000</w:t>
+            </w:r>
+          </w:p>
+        </w:tc>
+        <w:tc>
+          <w:tcPr>
+            <w:tcW w:type="dxa" w:w="1987"/>
+          </w:tcPr>
+          <w:p>
+            <w:r>
+              <w:t>91.3</w:t>
+            </w:r>
+          </w:p>
+        </w:tc>
+        <w:tc>
+          <w:tcPr>
+            <w:tcW w:type="dxa" w:w="1987"/>
+          </w:tcPr>
+          <w:p>
+            <w:r>
+              <w:t>85.8</w:t>
+            </w:r>
+          </w:p>
+        </w:tc>
+        <w:tc>
+          <w:tcPr>
+            <w:tcW w:type="dxa" w:w="1987"/>
+          </w:tcPr>
+          <w:p>
+            <w:r>
+              <w:t>105.4</w:t>
+            </w:r>
+          </w:p>
+        </w:tc>
+        <w:tc>
+          <w:tcPr>
+            <w:tcW w:type="dxa" w:w="1987"/>
+          </w:tcPr>
+          <w:p>
+            <w:r>
+              <w:t>0.16</w:t>
+            </w:r>
+          </w:p>
+        </w:tc>
+      </w:tr>
+      <w:tr>
+        <w:tc>
+          <w:tcPr>
+            <w:tcW w:type="dxa" w:w="1987"/>
+          </w:tcPr>
+          <w:p>
+            <w:r>
+              <w:t>32000</w:t>
+            </w:r>
+          </w:p>
+        </w:tc>
+        <w:tc>
+          <w:tcPr>
+            <w:tcW w:type="dxa" w:w="1987"/>
+          </w:tcPr>
+          <w:p>
+            <w:r>
+              <w:t>45.7</w:t>
+            </w:r>
+          </w:p>
+        </w:tc>
+        <w:tc>
+          <w:tcPr>
+            <w:tcW w:type="dxa" w:w="1987"/>
+          </w:tcPr>
+          <w:p>
+            <w:r>
+              <w:t>39.9</w:t>
+            </w:r>
+          </w:p>
+        </w:tc>
+        <w:tc>
+          <w:tcPr>
+            <w:tcW w:type="dxa" w:w="1987"/>
+          </w:tcPr>
+          <w:p>
+            <w:r>
+              <w:t>61.0</w:t>
+            </w:r>
+          </w:p>
+        </w:tc>
+        <w:tc>
+          <w:tcPr>
+            <w:tcW w:type="dxa" w:w="1987"/>
+          </w:tcPr>
+          <w:p>
+            <w:r>
+              <w:t>0.26</w:t>
+            </w:r>
+          </w:p>
+        </w:tc>
+      </w:tr>
+      <w:tr>
+        <w:tc>
+          <w:tcPr>
+            <w:tcW w:type="dxa" w:w="1987"/>
+          </w:tcPr>
+          <w:p>
+            <w:r>
+              <w:t>128000</w:t>
+            </w:r>
+          </w:p>
+        </w:tc>
+        <w:tc>
+          <w:tcPr>
+            <w:tcW w:type="dxa" w:w="1987"/>
+          </w:tcPr>
+          <w:p>
+            <w:r>
+              <w:t>47.5</w:t>
+            </w:r>
+          </w:p>
+        </w:tc>
+        <w:tc>
+          <w:tcPr>
+            <w:tcW w:type="dxa" w:w="1987"/>
+          </w:tcPr>
+          <w:p>
+            <w:r>
+              <w:t>28.3</w:t>
+            </w:r>
+          </w:p>
+        </w:tc>
+        <w:tc>
+          <w:tcPr>
+            <w:tcW w:type="dxa" w:w="1987"/>
+          </w:tcPr>
+          <w:p>
+            <w:r>
+              <w:t>115.3</w:t>
+            </w:r>
+          </w:p>
+        </w:tc>
+        <w:tc>
+          <w:tcPr>
+            <w:tcW w:type="dxa" w:w="1987"/>
+          </w:tcPr>
+          <w:p>
+            <w:r>
+              <w:t>0.74</w:t>
+            </w:r>
+          </w:p>
+        </w:tc>
+      </w:tr>
+      <w:tr>
+        <w:tc>
+          <w:tcPr>
+            <w:tcW w:type="dxa" w:w="1987"/>
+          </w:tcPr>
+          <w:p>
+            <w:r>
+              <w:t>512000</w:t>
+            </w:r>
+          </w:p>
+        </w:tc>
+        <w:tc>
+          <w:tcPr>
+            <w:tcW w:type="dxa" w:w="1987"/>
+          </w:tcPr>
+          <w:p>
+            <w:r>
+              <w:t>44.0</w:t>
+            </w:r>
+          </w:p>
+        </w:tc>
+        <w:tc>
+          <w:tcPr>
+            <w:tcW w:type="dxa" w:w="1987"/>
+          </w:tcPr>
+          <w:p>
+            <w:r>
+              <w:t>25.8</w:t>
+            </w:r>
+          </w:p>
+        </w:tc>
+        <w:tc>
+          <w:tcPr>
+            <w:tcW w:type="dxa" w:w="1987"/>
+          </w:tcPr>
+          <w:p>
+            <w:r>
+              <w:t>110.1</w:t>
+            </w:r>
+          </w:p>
+        </w:tc>
+        <w:tc>
+          <w:tcPr>
+            <w:tcW w:type="dxa" w:w="1987"/>
+          </w:tcPr>
+          <w:p>
+            <w:r>
+              <w:t>0.8</w:t>
+            </w:r>
+          </w:p>
+        </w:tc>
+      </w:tr>
+    </w:tbl>
+    <w:p>
+      <w:r>
+        <w:t>The medians show that large chunks were usually faster, but the high P90/CV values show why their means were not much better than 32 KB. With only 4-13 chunks, one slow remote gather or large response spike can dominate an entire run. A 32 KB chunk is therefore a good robust operating point for this setup: near-fastest mean, lower tail risk, and the fairness test was run at this size.</w:t>
       </w:r>
     </w:p>
     <w:p>
@@ -786,7 +1133,7 @@
     </w:p>
     <w:p>
       <w:r>
-        <w:t>The final result supports one focused conclusion: chunk size changed total request time mainly by changing the number of client-leader round trips. The fastest result was useful, but it only became trustworthy after we fixed port collisions, topology mistakes, cache behavior, Python setup problems, missing shard deployment, and benchmark defaults.</w:t>
+        <w:t>The final result supports one focused conclusion: chunk size has a knee around 32 KB. Below 32 KB, repeated pages dominate. Above 32 KB, the fixed gather/transfer floor and tail variance dominate. If optimizing only for mean or median, 512 KB wins by a small amount. If optimizing for robustness, fairness, and tail behavior, 32 KB is the better operating point for this two-laptop setup. This conclusion only became trustworthy after we fixed port collisions, topology mistakes, cache behavior, the hidden chunk cap, Python setup problems, missing shard deployment, and binary-layout validation.</w:t>
       </w:r>
     </w:p>
     <w:p>

</xml_diff>

<commit_message>
Polish mini2 poster and source references
</commit_message>
<xml_diff>
--- a/mini2-report.docx
+++ b/mini2-report.docx
@@ -98,6 +98,11 @@
     <w:p>
       <w:r>
         <w:t>The cluster uses a configured scatter-gather tree: A -&gt; B,H,G,I; B -&gt; C,D,E; E -&gt; F. A is the only public entry point. B-I own typed binary shards, and I is implemented in Python.</w:t>
+      </w:r>
+    </w:p>
+    <w:p>
+      <w:r>
+        <w:t>The data source is NYC 311 Service Requests from 2020 to Present. We used a 90,000-row subset from the public CSV so the test was repeatable and the Canvas submission did not include the large dataset.</w:t>
       </w:r>
     </w:p>
     <w:p>
@@ -986,6 +991,11 @@
     </w:tbl>
     <w:p>
       <w:r>
+        <w:t>CV is the sample standard deviation divided by the mean across the 30 runs.</w:t>
+      </w:r>
+    </w:p>
+    <w:p>
+      <w:r>
         <w:t>The medians show that large chunks were usually faster, but the high P90/CV values show why their means were not much better than 32 KB. With only 4-13 chunks, one slow remote gather or large response spike can dominate an entire run. A 32 KB chunk is therefore a good robust operating point for this setup: near-fastest mean, lower tail risk, and the fairness test was run at this size.</w:t>
       </w:r>
     </w:p>
@@ -1201,6 +1211,62 @@
       </w:pPr>
       <w:r>
         <w:t>Protocol Buffers, Language Guide (proto3): https://protobuf.dev/programming-guides/proto3/</w:t>
+      </w:r>
+    </w:p>
+    <w:p>
+      <w:pPr>
+        <w:pStyle w:val="ListBullet"/>
+      </w:pPr>
+      <w:r>
+        <w:t>Python struct documentation for the exact C++/Python binary record contract: https://docs.python.org/3/library/struct.html</w:t>
+      </w:r>
+    </w:p>
+    <w:p>
+      <w:pPr>
+        <w:pStyle w:val="ListBullet"/>
+      </w:pPr>
+      <w:r>
+        <w:t>CMake add_custom_command documentation for generating protobuf/gRPC sources during the build: https://cmake.org/cmake/help/latest/command/add_custom_command.html</w:t>
+      </w:r>
+    </w:p>
+    <w:p>
+      <w:pPr>
+        <w:pStyle w:val="ListBullet"/>
+      </w:pPr>
+      <w:r>
+        <w:t>gRPC C++ basics tutorial for protoc/grpc_cpp_plugin build pattern: https://grpc.io/docs/languages/cpp/basics/</w:t>
+      </w:r>
+    </w:p>
+    <w:p>
+      <w:pPr>
+        <w:pStyle w:val="ListBullet"/>
+      </w:pPr>
+      <w:r>
+        <w:t>PyYAML documentation for loading YAML configuration on the Python node: https://pyyaml.org/wiki/PyYAMLDocumentation</w:t>
+      </w:r>
+    </w:p>
+    <w:p>
+      <w:pPr>
+        <w:pStyle w:val="ListBullet"/>
+      </w:pPr>
+      <w:r>
+        <w:t>yaml-cpp project documentation for C++ YAML parsing: https://github.com/jbeder/yaml-cpp</w:t>
+      </w:r>
+    </w:p>
+    <w:p>
+      <w:pPr>
+        <w:pStyle w:val="ListBullet"/>
+      </w:pPr>
+      <w:r>
+        <w:t>python-pptx documentation for generating the one-slide poster: https://python-pptx.readthedocs.io/</w:t>
+      </w:r>
+    </w:p>
+    <w:p>
+      <w:pPr>
+        <w:pStyle w:val="ListBullet"/>
+      </w:pPr>
+      <w:r>
+        <w:t>Matplotlib barh documentation for the horizontal poster chart: https://matplotlib.org/stable/api/_as_gen/matplotlib.pyplot.barh.html</w:t>
       </w:r>
     </w:p>
     <w:p>

</xml_diff>